<commit_message>
feat: add project url on docx file
</commit_message>
<xml_diff>
--- a/relatorio_tp2_p2p.docx
+++ b/relatorio_tp2_p2p.docx
@@ -82,15 +82,7 @@
           <w:i/>
           <w:sz w:val="18"/>
         </w:rPr>
-        <w:t>código-</w:t>
-      </w:r>
-      <w:proofErr w:type="gramStart"/>
-      <w:r>
-        <w:rPr>
-          <w:i/>
-          <w:sz w:val="18"/>
-        </w:rPr>
-        <w:t>fonte</w:t>
+        <w:t>código-fonte</w:t>
       </w:r>
       <w:proofErr w:type="spellEnd"/>
       <w:r>
@@ -98,9 +90,38 @@
           <w:i/>
           <w:sz w:val="18"/>
         </w:rPr>
-        <w:t>:.</w:t>
+        <w:t>:</w:t>
       </w:r>
-      <w:proofErr w:type="gramEnd"/>
+      <w:r>
+        <w:t xml:space="preserve"> </w:t>
+      </w:r>
+      <w:hyperlink r:id="rId8" w:history="1">
+        <w:proofErr w:type="spellStart"/>
+        <w:r>
+          <w:rPr>
+            <w:rStyle w:val="Hyperlink"/>
+            <w:i/>
+            <w:sz w:val="18"/>
+          </w:rPr>
+          <w:t>MatheusMnz</w:t>
+        </w:r>
+        <w:proofErr w:type="spellEnd"/>
+        <w:r>
+          <w:rPr>
+            <w:rStyle w:val="Hyperlink"/>
+            <w:i/>
+            <w:sz w:val="18"/>
+          </w:rPr>
+          <w:t>/TP2_SistemasDistribuidos</w:t>
+        </w:r>
+      </w:hyperlink>
+      <w:r>
+        <w:rPr>
+          <w:i/>
+          <w:sz w:val="18"/>
+        </w:rPr>
+        <w:t>.</w:t>
+      </w:r>
     </w:p>
     <w:p>
       <w:pPr>
@@ -1217,7 +1238,7 @@
       </w:r>
     </w:p>
     <w:sectPr>
-      <w:footerReference w:type="default" r:id="rId8"/>
+      <w:footerReference w:type="default" r:id="rId9"/>
       <w:pgSz w:w="12240" w:h="15840"/>
       <w:pgMar w:top="850" w:right="907" w:bottom="850" w:left="907" w:header="720" w:footer="720" w:gutter="0"/>
       <w:cols w:space="720"/>
@@ -2121,7 +2142,6 @@
   <w:style w:type="character" w:default="1" w:styleId="Fontepargpadro">
     <w:name w:val="Default Paragraph Font"/>
     <w:uiPriority w:val="1"/>
-    <w:semiHidden/>
     <w:unhideWhenUsed/>
   </w:style>
   <w:style w:type="table" w:default="1" w:styleId="Tabelanormal">
@@ -12898,6 +12918,29 @@
         <w:shd w:val="clear" w:color="auto" w:fill="FBCAA2" w:themeFill="accent6" w:themeFillTint="7F"/>
       </w:tcPr>
     </w:tblStylePr>
+  </w:style>
+  <w:style w:type="character" w:styleId="Hyperlink">
+    <w:name w:val="Hyperlink"/>
+    <w:basedOn w:val="Fontepargpadro"/>
+    <w:uiPriority w:val="99"/>
+    <w:unhideWhenUsed/>
+    <w:rsid w:val="00820A93"/>
+    <w:rPr>
+      <w:color w:val="0000FF" w:themeColor="hyperlink"/>
+      <w:u w:val="single"/>
+    </w:rPr>
+  </w:style>
+  <w:style w:type="character" w:styleId="MenoPendente">
+    <w:name w:val="Unresolved Mention"/>
+    <w:basedOn w:val="Fontepargpadro"/>
+    <w:uiPriority w:val="99"/>
+    <w:semiHidden/>
+    <w:unhideWhenUsed/>
+    <w:rsid w:val="00820A93"/>
+    <w:rPr>
+      <w:color w:val="605E5C"/>
+      <w:shd w:val="clear" w:color="auto" w:fill="E1DFDD"/>
+    </w:rPr>
   </w:style>
 </w:styles>
 </file>

</xml_diff>